<commit_message>
docs: informe solo en Word (DOCX); se retiran PDF y ODT
</commit_message>
<xml_diff>
--- a/docs/report/SXA-RTX-Analytics-Informe-v1.1.3.docx
+++ b/docs/report/SXA-RTX-Analytics-Informe-v1.1.3.docx
@@ -78,7 +78,7 @@
         <w:rPr>
           <w:sz w:val="22"/>
         </w:rPr>
-        <w:t>Fecha: 2026-10-07 12:34</w:t>
+        <w:t>Fecha: 2026-10-07 13:07</w:t>
       </w:r>
     </w:p>
     <w:p>
@@ -1258,10 +1258,10 @@
           <w:sz w:val="22"/>
         </w:rPr>
         <w:drawing>
-          <wp:inline distT="0" distB="0" distL="0" distR="0" wp14:anchorId="3F7C0FF9" wp14:editId="79F61412">
+          <wp:inline distT="0" distB="0" distL="0" distR="0" wp14:anchorId="6F06D505" wp14:editId="510568A4">
             <wp:extent cx="5976000" cy="3735317"/>
             <wp:effectExtent l="0" t="0" r="5715" b="0"/>
-            <wp:docPr id="1971235460" name="Picture 1"/>
+            <wp:docPr id="154859157" name="Picture 1"/>
             <wp:cNvGraphicFramePr>
               <a:graphicFrameLocks xmlns:a="http://schemas.openxmlformats.org/drawingml/2006/main" noChangeAspect="1"/>
             </wp:cNvGraphicFramePr>
@@ -1269,7 +1269,7 @@
               <a:graphicData uri="http://schemas.openxmlformats.org/drawingml/2006/picture">
                 <pic:pic xmlns:pic="http://schemas.openxmlformats.org/drawingml/2006/picture">
                   <pic:nvPicPr>
-                    <pic:cNvPr id="1971235460" name=""/>
+                    <pic:cNvPr id="154859157" name=""/>
                     <pic:cNvPicPr/>
                   </pic:nvPicPr>
                   <pic:blipFill>
@@ -1363,10 +1363,10 @@
           <w:sz w:val="22"/>
         </w:rPr>
         <w:drawing>
-          <wp:inline distT="0" distB="0" distL="0" distR="0" wp14:anchorId="3A15F458" wp14:editId="7DC49787">
+          <wp:inline distT="0" distB="0" distL="0" distR="0" wp14:anchorId="11802336" wp14:editId="79A8850E">
             <wp:extent cx="5976000" cy="3735317"/>
             <wp:effectExtent l="0" t="0" r="5715" b="0"/>
-            <wp:docPr id="1127604168" name="Picture 2"/>
+            <wp:docPr id="1545288483" name="Picture 2"/>
             <wp:cNvGraphicFramePr>
               <a:graphicFrameLocks xmlns:a="http://schemas.openxmlformats.org/drawingml/2006/main" noChangeAspect="1"/>
             </wp:cNvGraphicFramePr>
@@ -1374,7 +1374,7 @@
               <a:graphicData uri="http://schemas.openxmlformats.org/drawingml/2006/picture">
                 <pic:pic xmlns:pic="http://schemas.openxmlformats.org/drawingml/2006/picture">
                   <pic:nvPicPr>
-                    <pic:cNvPr id="1127604168" name=""/>
+                    <pic:cNvPr id="1545288483" name=""/>
                     <pic:cNvPicPr/>
                   </pic:nvPicPr>
                   <pic:blipFill>
@@ -1435,10 +1435,10 @@
         </w:rPr>
         <w:lastRenderedPageBreak/>
         <w:drawing>
-          <wp:inline distT="0" distB="0" distL="0" distR="0" wp14:anchorId="59E71C58" wp14:editId="3146A214">
+          <wp:inline distT="0" distB="0" distL="0" distR="0" wp14:anchorId="35D9D487" wp14:editId="054315D0">
             <wp:extent cx="5976000" cy="5549959"/>
             <wp:effectExtent l="0" t="0" r="5715" b="0"/>
-            <wp:docPr id="814034632" name="Picture 3"/>
+            <wp:docPr id="583129838" name="Picture 3"/>
             <wp:cNvGraphicFramePr>
               <a:graphicFrameLocks xmlns:a="http://schemas.openxmlformats.org/drawingml/2006/main" noChangeAspect="1"/>
             </wp:cNvGraphicFramePr>
@@ -1446,7 +1446,7 @@
               <a:graphicData uri="http://schemas.openxmlformats.org/drawingml/2006/picture">
                 <pic:pic xmlns:pic="http://schemas.openxmlformats.org/drawingml/2006/picture">
                   <pic:nvPicPr>
-                    <pic:cNvPr id="814034632" name=""/>
+                    <pic:cNvPr id="583129838" name=""/>
                     <pic:cNvPicPr/>
                   </pic:nvPicPr>
                   <pic:blipFill>
@@ -1520,10 +1520,10 @@
         </w:rPr>
         <w:lastRenderedPageBreak/>
         <w:drawing>
-          <wp:inline distT="0" distB="0" distL="0" distR="0" wp14:anchorId="6351A566" wp14:editId="58578999">
+          <wp:inline distT="0" distB="0" distL="0" distR="0" wp14:anchorId="06E16B73" wp14:editId="417A20A4">
             <wp:extent cx="5976000" cy="3735317"/>
             <wp:effectExtent l="0" t="0" r="5715" b="0"/>
-            <wp:docPr id="1750978497" name="Picture 4"/>
+            <wp:docPr id="2127797762" name="Picture 4"/>
             <wp:cNvGraphicFramePr>
               <a:graphicFrameLocks xmlns:a="http://schemas.openxmlformats.org/drawingml/2006/main" noChangeAspect="1"/>
             </wp:cNvGraphicFramePr>
@@ -1531,7 +1531,7 @@
               <a:graphicData uri="http://schemas.openxmlformats.org/drawingml/2006/picture">
                 <pic:pic xmlns:pic="http://schemas.openxmlformats.org/drawingml/2006/picture">
                   <pic:nvPicPr>
-                    <pic:cNvPr id="1750978497" name=""/>
+                    <pic:cNvPr id="2127797762" name=""/>
                     <pic:cNvPicPr/>
                   </pic:nvPicPr>
                   <pic:blipFill>
@@ -1591,10 +1591,10 @@
           <w:sz w:val="22"/>
         </w:rPr>
         <w:drawing>
-          <wp:inline distT="0" distB="0" distL="0" distR="0" wp14:anchorId="7DFAE532" wp14:editId="2CEB4234">
+          <wp:inline distT="0" distB="0" distL="0" distR="0" wp14:anchorId="573527F2" wp14:editId="2915B980">
             <wp:extent cx="5976000" cy="3735317"/>
             <wp:effectExtent l="0" t="0" r="5715" b="0"/>
-            <wp:docPr id="1679419834" name="Picture 5"/>
+            <wp:docPr id="1947505549" name="Picture 5"/>
             <wp:cNvGraphicFramePr>
               <a:graphicFrameLocks xmlns:a="http://schemas.openxmlformats.org/drawingml/2006/main" noChangeAspect="1"/>
             </wp:cNvGraphicFramePr>
@@ -1602,7 +1602,7 @@
               <a:graphicData uri="http://schemas.openxmlformats.org/drawingml/2006/picture">
                 <pic:pic xmlns:pic="http://schemas.openxmlformats.org/drawingml/2006/picture">
                   <pic:nvPicPr>
-                    <pic:cNvPr id="1679419834" name=""/>
+                    <pic:cNvPr id="1947505549" name=""/>
                     <pic:cNvPicPr/>
                   </pic:nvPicPr>
                   <pic:blipFill>
@@ -1664,10 +1664,10 @@
         </w:rPr>
         <w:lastRenderedPageBreak/>
         <w:drawing>
-          <wp:inline distT="0" distB="0" distL="0" distR="0" wp14:anchorId="4E8DC1C2" wp14:editId="37575882">
+          <wp:inline distT="0" distB="0" distL="0" distR="0" wp14:anchorId="4FDF9F65" wp14:editId="1C028E31">
             <wp:extent cx="5976000" cy="3735317"/>
             <wp:effectExtent l="0" t="0" r="5715" b="0"/>
-            <wp:docPr id="1735472195" name="Picture 6"/>
+            <wp:docPr id="330000259" name="Picture 6"/>
             <wp:cNvGraphicFramePr>
               <a:graphicFrameLocks xmlns:a="http://schemas.openxmlformats.org/drawingml/2006/main" noChangeAspect="1"/>
             </wp:cNvGraphicFramePr>
@@ -1675,7 +1675,7 @@
               <a:graphicData uri="http://schemas.openxmlformats.org/drawingml/2006/picture">
                 <pic:pic xmlns:pic="http://schemas.openxmlformats.org/drawingml/2006/picture">
                   <pic:nvPicPr>
-                    <pic:cNvPr id="1735472195" name=""/>
+                    <pic:cNvPr id="330000259" name=""/>
                     <pic:cNvPicPr/>
                   </pic:nvPicPr>
                   <pic:blipFill>
@@ -1736,10 +1736,10 @@
           <w:sz w:val="22"/>
         </w:rPr>
         <w:drawing>
-          <wp:inline distT="0" distB="0" distL="0" distR="0" wp14:anchorId="37E511EE" wp14:editId="3609F70C">
+          <wp:inline distT="0" distB="0" distL="0" distR="0" wp14:anchorId="2BB8B4E7" wp14:editId="04A07DB0">
             <wp:extent cx="5976000" cy="3735317"/>
             <wp:effectExtent l="0" t="0" r="5715" b="0"/>
-            <wp:docPr id="1857664941" name="Picture 7"/>
+            <wp:docPr id="454275667" name="Picture 7"/>
             <wp:cNvGraphicFramePr>
               <a:graphicFrameLocks xmlns:a="http://schemas.openxmlformats.org/drawingml/2006/main" noChangeAspect="1"/>
             </wp:cNvGraphicFramePr>
@@ -1747,7 +1747,7 @@
               <a:graphicData uri="http://schemas.openxmlformats.org/drawingml/2006/picture">
                 <pic:pic xmlns:pic="http://schemas.openxmlformats.org/drawingml/2006/picture">
                   <pic:nvPicPr>
-                    <pic:cNvPr id="1857664941" name=""/>
+                    <pic:cNvPr id="454275667" name=""/>
                     <pic:cNvPicPr/>
                   </pic:nvPicPr>
                   <pic:blipFill>
@@ -1809,10 +1809,10 @@
         </w:rPr>
         <w:lastRenderedPageBreak/>
         <w:drawing>
-          <wp:inline distT="0" distB="0" distL="0" distR="0" wp14:anchorId="7824944D" wp14:editId="3AE31E30">
+          <wp:inline distT="0" distB="0" distL="0" distR="0" wp14:anchorId="77894E37" wp14:editId="0E739ED1">
             <wp:extent cx="5976000" cy="3735317"/>
             <wp:effectExtent l="0" t="0" r="5715" b="0"/>
-            <wp:docPr id="1632436928" name="Picture 8"/>
+            <wp:docPr id="1938406122" name="Picture 8"/>
             <wp:cNvGraphicFramePr>
               <a:graphicFrameLocks xmlns:a="http://schemas.openxmlformats.org/drawingml/2006/main" noChangeAspect="1"/>
             </wp:cNvGraphicFramePr>
@@ -1820,7 +1820,7 @@
               <a:graphicData uri="http://schemas.openxmlformats.org/drawingml/2006/picture">
                 <pic:pic xmlns:pic="http://schemas.openxmlformats.org/drawingml/2006/picture">
                   <pic:nvPicPr>
-                    <pic:cNvPr id="1632436928" name=""/>
+                    <pic:cNvPr id="1938406122" name=""/>
                     <pic:cNvPicPr/>
                   </pic:nvPicPr>
                   <pic:blipFill>
@@ -1881,10 +1881,10 @@
           <w:sz w:val="22"/>
         </w:rPr>
         <w:drawing>
-          <wp:inline distT="0" distB="0" distL="0" distR="0" wp14:anchorId="36F48648" wp14:editId="6AC24BCE">
+          <wp:inline distT="0" distB="0" distL="0" distR="0" wp14:anchorId="49F0740D" wp14:editId="0013B0D6">
             <wp:extent cx="5976000" cy="3735317"/>
             <wp:effectExtent l="0" t="0" r="5715" b="0"/>
-            <wp:docPr id="1919722815" name="Picture 9"/>
+            <wp:docPr id="92328052" name="Picture 9"/>
             <wp:cNvGraphicFramePr>
               <a:graphicFrameLocks xmlns:a="http://schemas.openxmlformats.org/drawingml/2006/main" noChangeAspect="1"/>
             </wp:cNvGraphicFramePr>
@@ -1892,7 +1892,7 @@
               <a:graphicData uri="http://schemas.openxmlformats.org/drawingml/2006/picture">
                 <pic:pic xmlns:pic="http://schemas.openxmlformats.org/drawingml/2006/picture">
                   <pic:nvPicPr>
-                    <pic:cNvPr id="1919722815" name=""/>
+                    <pic:cNvPr id="92328052" name=""/>
                     <pic:cNvPicPr/>
                   </pic:nvPicPr>
                   <pic:blipFill>
@@ -1966,10 +1966,10 @@
           <w:sz w:val="22"/>
         </w:rPr>
         <w:drawing>
-          <wp:inline distT="0" distB="0" distL="0" distR="0" wp14:anchorId="1710A62F" wp14:editId="3E30A1F7">
+          <wp:inline distT="0" distB="0" distL="0" distR="0" wp14:anchorId="6928F36C" wp14:editId="4D4235B8">
             <wp:extent cx="5976000" cy="3735317"/>
             <wp:effectExtent l="0" t="0" r="5715" b="0"/>
-            <wp:docPr id="1542700018" name="Picture 10"/>
+            <wp:docPr id="232781184" name="Picture 10"/>
             <wp:cNvGraphicFramePr>
               <a:graphicFrameLocks xmlns:a="http://schemas.openxmlformats.org/drawingml/2006/main" noChangeAspect="1"/>
             </wp:cNvGraphicFramePr>
@@ -1977,7 +1977,7 @@
               <a:graphicData uri="http://schemas.openxmlformats.org/drawingml/2006/picture">
                 <pic:pic xmlns:pic="http://schemas.openxmlformats.org/drawingml/2006/picture">
                   <pic:nvPicPr>
-                    <pic:cNvPr id="1542700018" name=""/>
+                    <pic:cNvPr id="232781184" name=""/>
                     <pic:cNvPicPr/>
                   </pic:nvPicPr>
                   <pic:blipFill>
@@ -2038,10 +2038,10 @@
         </w:rPr>
         <w:lastRenderedPageBreak/>
         <w:drawing>
-          <wp:inline distT="0" distB="0" distL="0" distR="0" wp14:anchorId="4AEFA46D" wp14:editId="32B7547A">
+          <wp:inline distT="0" distB="0" distL="0" distR="0" wp14:anchorId="2CEFA431" wp14:editId="6BB6575B">
             <wp:extent cx="5976000" cy="5699169"/>
             <wp:effectExtent l="0" t="0" r="5715" b="0"/>
-            <wp:docPr id="479843686" name="Picture 11"/>
+            <wp:docPr id="712024584" name="Picture 11"/>
             <wp:cNvGraphicFramePr>
               <a:graphicFrameLocks xmlns:a="http://schemas.openxmlformats.org/drawingml/2006/main" noChangeAspect="1"/>
             </wp:cNvGraphicFramePr>
@@ -2049,7 +2049,7 @@
               <a:graphicData uri="http://schemas.openxmlformats.org/drawingml/2006/picture">
                 <pic:pic xmlns:pic="http://schemas.openxmlformats.org/drawingml/2006/picture">
                   <pic:nvPicPr>
-                    <pic:cNvPr id="479843686" name=""/>
+                    <pic:cNvPr id="712024584" name=""/>
                     <pic:cNvPicPr/>
                   </pic:nvPicPr>
                   <pic:blipFill>
@@ -2112,10 +2112,10 @@
           <w:noProof/>
         </w:rPr>
         <w:drawing>
-          <wp:inline distT="0" distB="0" distL="0" distR="0" wp14:anchorId="0817C491" wp14:editId="3BF7F679">
+          <wp:inline distT="0" distB="0" distL="0" distR="0" wp14:anchorId="649CF60C" wp14:editId="44A43C9E">
             <wp:extent cx="5976000" cy="3735317"/>
             <wp:effectExtent l="0" t="0" r="5715" b="0"/>
-            <wp:docPr id="518292478" name="Picture 12"/>
+            <wp:docPr id="1994150230" name="Picture 12"/>
             <wp:cNvGraphicFramePr>
               <a:graphicFrameLocks xmlns:a="http://schemas.openxmlformats.org/drawingml/2006/main" noChangeAspect="1"/>
             </wp:cNvGraphicFramePr>
@@ -2123,7 +2123,7 @@
               <a:graphicData uri="http://schemas.openxmlformats.org/drawingml/2006/picture">
                 <pic:pic xmlns:pic="http://schemas.openxmlformats.org/drawingml/2006/picture">
                   <pic:nvPicPr>
-                    <pic:cNvPr id="518292478" name=""/>
+                    <pic:cNvPr id="1994150230" name=""/>
                     <pic:cNvPicPr/>
                   </pic:nvPicPr>
                   <pic:blipFill>
@@ -2741,10 +2741,10 @@
           <w:noProof/>
         </w:rPr>
         <w:drawing>
-          <wp:inline distT="0" distB="0" distL="0" distR="0" wp14:anchorId="7D1EC18C" wp14:editId="61560483">
+          <wp:inline distT="0" distB="0" distL="0" distR="0" wp14:anchorId="631BFDCB" wp14:editId="5AECAC8B">
             <wp:extent cx="5976000" cy="3735317"/>
             <wp:effectExtent l="0" t="0" r="5715" b="0"/>
-            <wp:docPr id="188442163" name="Picture 13"/>
+            <wp:docPr id="1804694689" name="Picture 13"/>
             <wp:cNvGraphicFramePr>
               <a:graphicFrameLocks xmlns:a="http://schemas.openxmlformats.org/drawingml/2006/main" noChangeAspect="1"/>
             </wp:cNvGraphicFramePr>
@@ -2752,7 +2752,7 @@
               <a:graphicData uri="http://schemas.openxmlformats.org/drawingml/2006/picture">
                 <pic:pic xmlns:pic="http://schemas.openxmlformats.org/drawingml/2006/picture">
                   <pic:nvPicPr>
-                    <pic:cNvPr id="188442163" name=""/>
+                    <pic:cNvPr id="1804694689" name=""/>
                     <pic:cNvPicPr/>
                   </pic:nvPicPr>
                   <pic:blipFill>
@@ -5327,7 +5327,7 @@
     <w:link w:val="Heading1Char"/>
     <w:uiPriority w:val="9"/>
     <w:qFormat/>
-    <w:rsid w:val="00216B6B"/>
+    <w:rsid w:val="00B158DB"/>
     <w:pPr>
       <w:keepNext/>
       <w:keepLines/>
@@ -5349,7 +5349,7 @@
     <w:uiPriority w:val="9"/>
     <w:unhideWhenUsed/>
     <w:qFormat/>
-    <w:rsid w:val="00216B6B"/>
+    <w:rsid w:val="00B158DB"/>
     <w:pPr>
       <w:keepNext/>
       <w:keepLines/>
@@ -5372,7 +5372,7 @@
     <w:semiHidden/>
     <w:unhideWhenUsed/>
     <w:qFormat/>
-    <w:rsid w:val="00216B6B"/>
+    <w:rsid w:val="00B158DB"/>
     <w:pPr>
       <w:keepNext/>
       <w:keepLines/>
@@ -5395,7 +5395,7 @@
     <w:semiHidden/>
     <w:unhideWhenUsed/>
     <w:qFormat/>
-    <w:rsid w:val="00216B6B"/>
+    <w:rsid w:val="00B158DB"/>
     <w:pPr>
       <w:keepNext/>
       <w:keepLines/>
@@ -5418,7 +5418,7 @@
     <w:semiHidden/>
     <w:unhideWhenUsed/>
     <w:qFormat/>
-    <w:rsid w:val="00216B6B"/>
+    <w:rsid w:val="00B158DB"/>
     <w:pPr>
       <w:keepNext/>
       <w:keepLines/>
@@ -5439,7 +5439,7 @@
     <w:semiHidden/>
     <w:unhideWhenUsed/>
     <w:qFormat/>
-    <w:rsid w:val="00216B6B"/>
+    <w:rsid w:val="00B158DB"/>
     <w:pPr>
       <w:keepNext/>
       <w:keepLines/>
@@ -5462,7 +5462,7 @@
     <w:semiHidden/>
     <w:unhideWhenUsed/>
     <w:qFormat/>
-    <w:rsid w:val="00216B6B"/>
+    <w:rsid w:val="00B158DB"/>
     <w:pPr>
       <w:keepNext/>
       <w:keepLines/>
@@ -5483,7 +5483,7 @@
     <w:semiHidden/>
     <w:unhideWhenUsed/>
     <w:qFormat/>
-    <w:rsid w:val="00216B6B"/>
+    <w:rsid w:val="00B158DB"/>
     <w:pPr>
       <w:keepNext/>
       <w:keepLines/>
@@ -5506,7 +5506,7 @@
     <w:semiHidden/>
     <w:unhideWhenUsed/>
     <w:qFormat/>
-    <w:rsid w:val="00216B6B"/>
+    <w:rsid w:val="00B158DB"/>
     <w:pPr>
       <w:keepNext/>
       <w:keepLines/>
@@ -5550,7 +5550,7 @@
     <w:basedOn w:val="DefaultParagraphFont"/>
     <w:link w:val="Heading1"/>
     <w:uiPriority w:val="9"/>
-    <w:rsid w:val="00216B6B"/>
+    <w:rsid w:val="00B158DB"/>
     <w:rPr>
       <w:rFonts w:asciiTheme="majorHAnsi" w:eastAsiaTheme="majorEastAsia" w:hAnsiTheme="majorHAnsi" w:cstheme="majorBidi"/>
       <w:color w:val="0F4761" w:themeColor="accent1" w:themeShade="BF"/>
@@ -5563,7 +5563,7 @@
     <w:basedOn w:val="DefaultParagraphFont"/>
     <w:link w:val="Heading2"/>
     <w:uiPriority w:val="9"/>
-    <w:rsid w:val="00216B6B"/>
+    <w:rsid w:val="00B158DB"/>
     <w:rPr>
       <w:rFonts w:asciiTheme="majorHAnsi" w:eastAsiaTheme="majorEastAsia" w:hAnsiTheme="majorHAnsi" w:cstheme="majorBidi"/>
       <w:color w:val="0F4761" w:themeColor="accent1" w:themeShade="BF"/>
@@ -5577,7 +5577,7 @@
     <w:link w:val="Heading3"/>
     <w:uiPriority w:val="9"/>
     <w:semiHidden/>
-    <w:rsid w:val="00216B6B"/>
+    <w:rsid w:val="00B158DB"/>
     <w:rPr>
       <w:rFonts w:eastAsiaTheme="majorEastAsia" w:cstheme="majorBidi"/>
       <w:color w:val="0F4761" w:themeColor="accent1" w:themeShade="BF"/>
@@ -5591,7 +5591,7 @@
     <w:link w:val="Heading4"/>
     <w:uiPriority w:val="9"/>
     <w:semiHidden/>
-    <w:rsid w:val="00216B6B"/>
+    <w:rsid w:val="00B158DB"/>
     <w:rPr>
       <w:rFonts w:eastAsiaTheme="majorEastAsia" w:cstheme="majorBidi"/>
       <w:i/>
@@ -5605,7 +5605,7 @@
     <w:link w:val="Heading5"/>
     <w:uiPriority w:val="9"/>
     <w:semiHidden/>
-    <w:rsid w:val="00216B6B"/>
+    <w:rsid w:val="00B158DB"/>
     <w:rPr>
       <w:rFonts w:eastAsiaTheme="majorEastAsia" w:cstheme="majorBidi"/>
       <w:color w:val="0F4761" w:themeColor="accent1" w:themeShade="BF"/>
@@ -5617,7 +5617,7 @@
     <w:link w:val="Heading6"/>
     <w:uiPriority w:val="9"/>
     <w:semiHidden/>
-    <w:rsid w:val="00216B6B"/>
+    <w:rsid w:val="00B158DB"/>
     <w:rPr>
       <w:rFonts w:eastAsiaTheme="majorEastAsia" w:cstheme="majorBidi"/>
       <w:i/>
@@ -5631,7 +5631,7 @@
     <w:link w:val="Heading7"/>
     <w:uiPriority w:val="9"/>
     <w:semiHidden/>
-    <w:rsid w:val="00216B6B"/>
+    <w:rsid w:val="00B158DB"/>
     <w:rPr>
       <w:rFonts w:eastAsiaTheme="majorEastAsia" w:cstheme="majorBidi"/>
       <w:color w:val="595959" w:themeColor="text1" w:themeTint="A6"/>
@@ -5643,7 +5643,7 @@
     <w:link w:val="Heading8"/>
     <w:uiPriority w:val="9"/>
     <w:semiHidden/>
-    <w:rsid w:val="00216B6B"/>
+    <w:rsid w:val="00B158DB"/>
     <w:rPr>
       <w:rFonts w:eastAsiaTheme="majorEastAsia" w:cstheme="majorBidi"/>
       <w:i/>
@@ -5657,7 +5657,7 @@
     <w:link w:val="Heading9"/>
     <w:uiPriority w:val="9"/>
     <w:semiHidden/>
-    <w:rsid w:val="00216B6B"/>
+    <w:rsid w:val="00B158DB"/>
     <w:rPr>
       <w:rFonts w:eastAsiaTheme="majorEastAsia" w:cstheme="majorBidi"/>
       <w:color w:val="272727" w:themeColor="text1" w:themeTint="D8"/>
@@ -5670,7 +5670,7 @@
     <w:link w:val="TitleChar"/>
     <w:uiPriority w:val="10"/>
     <w:qFormat/>
-    <w:rsid w:val="00216B6B"/>
+    <w:rsid w:val="00B158DB"/>
     <w:pPr>
       <w:spacing w:after="80" w:line="240" w:lineRule="auto"/>
       <w:contextualSpacing/>
@@ -5688,7 +5688,7 @@
     <w:basedOn w:val="DefaultParagraphFont"/>
     <w:link w:val="Title"/>
     <w:uiPriority w:val="10"/>
-    <w:rsid w:val="00216B6B"/>
+    <w:rsid w:val="00B158DB"/>
     <w:rPr>
       <w:rFonts w:asciiTheme="majorHAnsi" w:eastAsiaTheme="majorEastAsia" w:hAnsiTheme="majorHAnsi" w:cstheme="majorBidi"/>
       <w:spacing w:val="-10"/>
@@ -5704,7 +5704,7 @@
     <w:link w:val="SubtitleChar"/>
     <w:uiPriority w:val="11"/>
     <w:qFormat/>
-    <w:rsid w:val="00216B6B"/>
+    <w:rsid w:val="00B158DB"/>
     <w:pPr>
       <w:numPr>
         <w:ilvl w:val="1"/>
@@ -5723,7 +5723,7 @@
     <w:basedOn w:val="DefaultParagraphFont"/>
     <w:link w:val="Subtitle"/>
     <w:uiPriority w:val="11"/>
-    <w:rsid w:val="00216B6B"/>
+    <w:rsid w:val="00B158DB"/>
     <w:rPr>
       <w:rFonts w:eastAsiaTheme="majorEastAsia" w:cstheme="majorBidi"/>
       <w:color w:val="595959" w:themeColor="text1" w:themeTint="A6"/>
@@ -5739,7 +5739,7 @@
     <w:link w:val="QuoteChar"/>
     <w:uiPriority w:val="29"/>
     <w:qFormat/>
-    <w:rsid w:val="00216B6B"/>
+    <w:rsid w:val="00B158DB"/>
     <w:pPr>
       <w:spacing w:before="160"/>
       <w:jc w:val="center"/>
@@ -5755,7 +5755,7 @@
     <w:basedOn w:val="DefaultParagraphFont"/>
     <w:link w:val="Quote"/>
     <w:uiPriority w:val="29"/>
-    <w:rsid w:val="00216B6B"/>
+    <w:rsid w:val="00B158DB"/>
     <w:rPr>
       <w:i/>
       <w:iCs/>
@@ -5767,7 +5767,7 @@
     <w:basedOn w:val="Normal"/>
     <w:uiPriority w:val="34"/>
     <w:qFormat/>
-    <w:rsid w:val="00216B6B"/>
+    <w:rsid w:val="00B158DB"/>
     <w:pPr>
       <w:ind w:left="720"/>
       <w:contextualSpacing/>
@@ -5778,7 +5778,7 @@
     <w:basedOn w:val="DefaultParagraphFont"/>
     <w:uiPriority w:val="21"/>
     <w:qFormat/>
-    <w:rsid w:val="00216B6B"/>
+    <w:rsid w:val="00B158DB"/>
     <w:rPr>
       <w:i/>
       <w:iCs/>
@@ -5792,7 +5792,7 @@
     <w:link w:val="IntenseQuoteChar"/>
     <w:uiPriority w:val="30"/>
     <w:qFormat/>
-    <w:rsid w:val="00216B6B"/>
+    <w:rsid w:val="00B158DB"/>
     <w:pPr>
       <w:pBdr>
         <w:top w:val="single" w:sz="4" w:space="10" w:color="0F4761" w:themeColor="accent1" w:themeShade="BF"/>
@@ -5813,7 +5813,7 @@
     <w:basedOn w:val="DefaultParagraphFont"/>
     <w:link w:val="IntenseQuote"/>
     <w:uiPriority w:val="30"/>
-    <w:rsid w:val="00216B6B"/>
+    <w:rsid w:val="00B158DB"/>
     <w:rPr>
       <w:i/>
       <w:iCs/>
@@ -5825,7 +5825,7 @@
     <w:basedOn w:val="DefaultParagraphFont"/>
     <w:uiPriority w:val="32"/>
     <w:qFormat/>
-    <w:rsid w:val="00216B6B"/>
+    <w:rsid w:val="00B158DB"/>
     <w:rPr>
       <w:b/>
       <w:bCs/>
@@ -5840,7 +5840,7 @@
     <w:link w:val="HeaderChar"/>
     <w:uiPriority w:val="99"/>
     <w:unhideWhenUsed/>
-    <w:rsid w:val="00216B6B"/>
+    <w:rsid w:val="00B158DB"/>
     <w:pPr>
       <w:tabs>
         <w:tab w:val="center" w:pos="4419"/>
@@ -5854,7 +5854,7 @@
     <w:basedOn w:val="DefaultParagraphFont"/>
     <w:link w:val="Header"/>
     <w:uiPriority w:val="99"/>
-    <w:rsid w:val="00216B6B"/>
+    <w:rsid w:val="00B158DB"/>
   </w:style>
   <w:style w:type="paragraph" w:styleId="Footer">
     <w:name w:val="footer"/>
@@ -5862,7 +5862,7 @@
     <w:link w:val="FooterChar"/>
     <w:uiPriority w:val="99"/>
     <w:unhideWhenUsed/>
-    <w:rsid w:val="00216B6B"/>
+    <w:rsid w:val="00B158DB"/>
     <w:pPr>
       <w:tabs>
         <w:tab w:val="center" w:pos="4419"/>
@@ -5876,7 +5876,7 @@
     <w:basedOn w:val="DefaultParagraphFont"/>
     <w:link w:val="Footer"/>
     <w:uiPriority w:val="99"/>
-    <w:rsid w:val="00216B6B"/>
+    <w:rsid w:val="00B158DB"/>
   </w:style>
 </w:styles>
 </file>

</xml_diff>

<commit_message>
feat: columna de origen configurable y resolucion de NombrePC/TipoMaquina en resultados de /query
</commit_message>
<xml_diff>
--- a/docs/report/SXA-RTX-Analytics-Informe-v1.1.3.docx
+++ b/docs/report/SXA-RTX-Analytics-Informe-v1.1.3.docx
@@ -121,14 +121,17 @@
     </w:p>
     <w:p>
       <w:pPr>
+        <w:jc w:val="center"/>
         <w:rPr>
           <w:sz w:val="22"/>
+          <w:lang w:val="en-US"/>
         </w:rPr>
       </w:pPr>
       <w:r>
         <w:rPr>
           <w:i/>
           <w:sz w:val="20"/>
+          <w:lang w:val="en-US"/>
         </w:rPr>
         <w:t>Release: https://github.com/hector1516/SXA-RTX-Analytics/releases/tag/v1.1.3</w:t>
       </w:r>
@@ -137,11 +140,13 @@
       <w:pPr>
         <w:rPr>
           <w:sz w:val="22"/>
+          <w:lang w:val="en-US"/>
         </w:rPr>
       </w:pPr>
       <w:r>
         <w:rPr>
           <w:sz w:val="22"/>
+          <w:lang w:val="en-US"/>
         </w:rPr>
         <w:br w:type="page"/>
       </w:r>
@@ -152,7 +157,7 @@
       </w:pPr>
       <w:r>
         <w:lastRenderedPageBreak/>
-        <w:t>1. Resumen ejecutivo</w:t>
+        <w:t>1. Resumen</w:t>
       </w:r>
     </w:p>
     <w:p>
@@ -301,8 +306,14 @@
         <w:pStyle w:val="ListParagraph"/>
         <w:spacing w:after="40"/>
         <w:ind w:left="340"/>
-      </w:pPr>
-      <w:r>
+        <w:rPr>
+          <w:lang w:val="en-US"/>
+        </w:rPr>
+      </w:pPr>
+      <w:r>
+        <w:rPr>
+          <w:lang w:val="en-US"/>
+        </w:rPr>
         <w:t>•  Health checks en /health (JSON) y /health/live (texto).</w:t>
       </w:r>
     </w:p>
@@ -337,12 +348,6 @@
         <w:gridCol w:w="7340"/>
       </w:tblGrid>
       <w:tr>
-        <w:tblPrEx>
-          <w:tblCellMar>
-            <w:top w:w="0" w:type="dxa"/>
-            <w:bottom w:w="0" w:type="dxa"/>
-          </w:tblCellMar>
-        </w:tblPrEx>
         <w:tc>
           <w:tcPr>
             <w:tcW w:w="1160" w:type="dxa"/>
@@ -387,12 +392,6 @@
         </w:tc>
       </w:tr>
       <w:tr>
-        <w:tblPrEx>
-          <w:tblCellMar>
-            <w:top w:w="0" w:type="dxa"/>
-            <w:bottom w:w="0" w:type="dxa"/>
-          </w:tblCellMar>
-        </w:tblPrEx>
         <w:tc>
           <w:tcPr>
             <w:tcW w:w="1160" w:type="dxa"/>
@@ -431,12 +430,6 @@
         </w:tc>
       </w:tr>
       <w:tr>
-        <w:tblPrEx>
-          <w:tblCellMar>
-            <w:top w:w="0" w:type="dxa"/>
-            <w:bottom w:w="0" w:type="dxa"/>
-          </w:tblCellMar>
-        </w:tblPrEx>
         <w:tc>
           <w:tcPr>
             <w:tcW w:w="1160" w:type="dxa"/>
@@ -463,11 +456,13 @@
             <w:pPr>
               <w:rPr>
                 <w:sz w:val="19"/>
-              </w:rPr>
-            </w:pPr>
-            <w:r>
-              <w:rPr>
-                <w:sz w:val="19"/>
+                <w:lang w:val="en-US"/>
+              </w:rPr>
+            </w:pPr>
+            <w:r>
+              <w:rPr>
+                <w:sz w:val="19"/>
+                <w:lang w:val="en-US"/>
               </w:rPr>
               <w:t>.NET 10 (ASP.NET Core), Serilog, Health Checks</w:t>
             </w:r>
@@ -475,12 +470,6 @@
         </w:tc>
       </w:tr>
       <w:tr>
-        <w:tblPrEx>
-          <w:tblCellMar>
-            <w:top w:w="0" w:type="dxa"/>
-            <w:bottom w:w="0" w:type="dxa"/>
-          </w:tblCellMar>
-        </w:tblPrEx>
         <w:tc>
           <w:tcPr>
             <w:tcW w:w="1160" w:type="dxa"/>
@@ -507,11 +496,13 @@
             <w:pPr>
               <w:rPr>
                 <w:sz w:val="19"/>
-              </w:rPr>
-            </w:pPr>
-            <w:r>
-              <w:rPr>
-                <w:sz w:val="19"/>
+                <w:lang w:val="en-US"/>
+              </w:rPr>
+            </w:pPr>
+            <w:r>
+              <w:rPr>
+                <w:sz w:val="19"/>
+                <w:lang w:val="en-US"/>
               </w:rPr>
               <w:t>EF Core 10 + SQL Server (Microsoft.Data.SqlClient), ODBC para MAPICS</w:t>
             </w:r>
@@ -519,12 +510,6 @@
         </w:tc>
       </w:tr>
       <w:tr>
-        <w:tblPrEx>
-          <w:tblCellMar>
-            <w:top w:w="0" w:type="dxa"/>
-            <w:bottom w:w="0" w:type="dxa"/>
-          </w:tblCellMar>
-        </w:tblPrEx>
         <w:tc>
           <w:tcPr>
             <w:tcW w:w="1160" w:type="dxa"/>
@@ -563,12 +548,6 @@
         </w:tc>
       </w:tr>
       <w:tr>
-        <w:tblPrEx>
-          <w:tblCellMar>
-            <w:top w:w="0" w:type="dxa"/>
-            <w:bottom w:w="0" w:type="dxa"/>
-          </w:tblCellMar>
-        </w:tblPrEx>
         <w:tc>
           <w:tcPr>
             <w:tcW w:w="1160" w:type="dxa"/>
@@ -595,11 +574,13 @@
             <w:pPr>
               <w:rPr>
                 <w:sz w:val="19"/>
-              </w:rPr>
-            </w:pPr>
-            <w:r>
-              <w:rPr>
-                <w:sz w:val="19"/>
+                <w:lang w:val="en-US"/>
+              </w:rPr>
+            </w:pPr>
+            <w:r>
+              <w:rPr>
+                <w:sz w:val="19"/>
+                <w:lang w:val="en-US"/>
               </w:rPr>
               <w:t>Inno Setup 6, PowerShell, GitHub Actions (windows-latest)</w:t>
             </w:r>
@@ -607,9 +588,23 @@
         </w:tc>
       </w:tr>
     </w:tbl>
-    <w:p/>
-    <w:p>
-      <w:r>
+    <w:p>
+      <w:pPr>
+        <w:rPr>
+          <w:lang w:val="en-US"/>
+        </w:rPr>
+      </w:pPr>
+    </w:p>
+    <w:p>
+      <w:pPr>
+        <w:rPr>
+          <w:lang w:val="en-US"/>
+        </w:rPr>
+      </w:pPr>
+      <w:r>
+        <w:rPr>
+          <w:lang w:val="en-US"/>
+        </w:rPr>
         <w:lastRenderedPageBreak/>
         <w:br w:type="page"/>
       </w:r>
@@ -669,12 +664,14 @@
         <w:rPr>
           <w:rFonts w:ascii="Consolas" w:hAnsi="Consolas"/>
           <w:sz w:val="17"/>
-        </w:rPr>
-      </w:pPr>
-      <w:r>
-        <w:rPr>
-          <w:rFonts w:ascii="Consolas" w:hAnsi="Consolas"/>
-          <w:sz w:val="17"/>
+          <w:lang w:val="en-US"/>
+        </w:rPr>
+      </w:pPr>
+      <w:r>
+        <w:rPr>
+          <w:rFonts w:ascii="Consolas" w:hAnsi="Consolas"/>
+          <w:sz w:val="17"/>
+          <w:lang w:val="en-US"/>
         </w:rPr>
         <w:t>SXA.RTX.Analytics.Infrastructure  EF Core, SQL Server, ODBC, exportadores Excel/PDF.</w:t>
       </w:r>
@@ -686,12 +683,14 @@
         <w:rPr>
           <w:rFonts w:ascii="Consolas" w:hAnsi="Consolas"/>
           <w:sz w:val="17"/>
-        </w:rPr>
-      </w:pPr>
-      <w:r>
-        <w:rPr>
-          <w:rFonts w:ascii="Consolas" w:hAnsi="Consolas"/>
-          <w:sz w:val="17"/>
+          <w:lang w:val="en-US"/>
+        </w:rPr>
+      </w:pPr>
+      <w:r>
+        <w:rPr>
+          <w:rFonts w:ascii="Consolas" w:hAnsi="Consolas"/>
+          <w:sz w:val="17"/>
+          <w:lang w:val="en-US"/>
         </w:rPr>
         <w:t>SXA.RTX.Analytics.Reporting       Reporting Engine y abstraccion IDataSourceProvider.</w:t>
       </w:r>
@@ -703,12 +702,14 @@
         <w:rPr>
           <w:rFonts w:ascii="Consolas" w:hAnsi="Consolas"/>
           <w:sz w:val="17"/>
-        </w:rPr>
-      </w:pPr>
-      <w:r>
-        <w:rPr>
-          <w:rFonts w:ascii="Consolas" w:hAnsi="Consolas"/>
-          <w:sz w:val="17"/>
+          <w:lang w:val="en-US"/>
+        </w:rPr>
+      </w:pPr>
+      <w:r>
+        <w:rPr>
+          <w:rFonts w:ascii="Consolas" w:hAnsi="Consolas"/>
+          <w:sz w:val="17"/>
+          <w:lang w:val="en-US"/>
         </w:rPr>
         <w:t>SXA.RTX.Analytics.Web             UI Blazor, autenticacion, endpoints API, hosting.</w:t>
       </w:r>
@@ -821,12 +822,6 @@
         <w:gridCol w:w="5435"/>
       </w:tblGrid>
       <w:tr>
-        <w:tblPrEx>
-          <w:tblCellMar>
-            <w:top w:w="0" w:type="dxa"/>
-            <w:bottom w:w="0" w:type="dxa"/>
-          </w:tblCellMar>
-        </w:tblPrEx>
         <w:tc>
           <w:tcPr>
             <w:tcW w:w="2690" w:type="dxa"/>
@@ -871,12 +866,6 @@
         </w:tc>
       </w:tr>
       <w:tr>
-        <w:tblPrEx>
-          <w:tblCellMar>
-            <w:top w:w="0" w:type="dxa"/>
-            <w:bottom w:w="0" w:type="dxa"/>
-          </w:tblCellMar>
-        </w:tblPrEx>
         <w:tc>
           <w:tcPr>
             <w:tcW w:w="2690" w:type="dxa"/>
@@ -915,12 +904,6 @@
         </w:tc>
       </w:tr>
       <w:tr>
-        <w:tblPrEx>
-          <w:tblCellMar>
-            <w:top w:w="0" w:type="dxa"/>
-            <w:bottom w:w="0" w:type="dxa"/>
-          </w:tblCellMar>
-        </w:tblPrEx>
         <w:tc>
           <w:tcPr>
             <w:tcW w:w="2690" w:type="dxa"/>
@@ -959,12 +942,6 @@
         </w:tc>
       </w:tr>
       <w:tr>
-        <w:tblPrEx>
-          <w:tblCellMar>
-            <w:top w:w="0" w:type="dxa"/>
-            <w:bottom w:w="0" w:type="dxa"/>
-          </w:tblCellMar>
-        </w:tblPrEx>
         <w:tc>
           <w:tcPr>
             <w:tcW w:w="2690" w:type="dxa"/>
@@ -1003,12 +980,6 @@
         </w:tc>
       </w:tr>
       <w:tr>
-        <w:tblPrEx>
-          <w:tblCellMar>
-            <w:top w:w="0" w:type="dxa"/>
-            <w:bottom w:w="0" w:type="dxa"/>
-          </w:tblCellMar>
-        </w:tblPrEx>
         <w:tc>
           <w:tcPr>
             <w:tcW w:w="2690" w:type="dxa"/>
@@ -1047,12 +1018,6 @@
         </w:tc>
       </w:tr>
       <w:tr>
-        <w:tblPrEx>
-          <w:tblCellMar>
-            <w:top w:w="0" w:type="dxa"/>
-            <w:bottom w:w="0" w:type="dxa"/>
-          </w:tblCellMar>
-        </w:tblPrEx>
         <w:tc>
           <w:tcPr>
             <w:tcW w:w="2690" w:type="dxa"/>
@@ -1091,12 +1056,6 @@
         </w:tc>
       </w:tr>
       <w:tr>
-        <w:tblPrEx>
-          <w:tblCellMar>
-            <w:top w:w="0" w:type="dxa"/>
-            <w:bottom w:w="0" w:type="dxa"/>
-          </w:tblCellMar>
-        </w:tblPrEx>
         <w:tc>
           <w:tcPr>
             <w:tcW w:w="2690" w:type="dxa"/>
@@ -2422,12 +2381,6 @@
         <w:gridCol w:w="1745"/>
       </w:tblGrid>
       <w:tr>
-        <w:tblPrEx>
-          <w:tblCellMar>
-            <w:top w:w="0" w:type="dxa"/>
-            <w:bottom w:w="0" w:type="dxa"/>
-          </w:tblCellMar>
-        </w:tblPrEx>
         <w:tc>
           <w:tcPr>
             <w:tcW w:w="4700" w:type="dxa"/>
@@ -2472,12 +2425,6 @@
         </w:tc>
       </w:tr>
       <w:tr>
-        <w:tblPrEx>
-          <w:tblCellMar>
-            <w:top w:w="0" w:type="dxa"/>
-            <w:bottom w:w="0" w:type="dxa"/>
-          </w:tblCellMar>
-        </w:tblPrEx>
         <w:tc>
           <w:tcPr>
             <w:tcW w:w="4700" w:type="dxa"/>
@@ -2516,12 +2463,6 @@
         </w:tc>
       </w:tr>
       <w:tr>
-        <w:tblPrEx>
-          <w:tblCellMar>
-            <w:top w:w="0" w:type="dxa"/>
-            <w:bottom w:w="0" w:type="dxa"/>
-          </w:tblCellMar>
-        </w:tblPrEx>
         <w:tc>
           <w:tcPr>
             <w:tcW w:w="4700" w:type="dxa"/>
@@ -2560,12 +2501,6 @@
         </w:tc>
       </w:tr>
       <w:tr>
-        <w:tblPrEx>
-          <w:tblCellMar>
-            <w:top w:w="0" w:type="dxa"/>
-            <w:bottom w:w="0" w:type="dxa"/>
-          </w:tblCellMar>
-        </w:tblPrEx>
         <w:tc>
           <w:tcPr>
             <w:tcW w:w="4700" w:type="dxa"/>
@@ -2604,12 +2539,6 @@
         </w:tc>
       </w:tr>
       <w:tr>
-        <w:tblPrEx>
-          <w:tblCellMar>
-            <w:top w:w="0" w:type="dxa"/>
-            <w:bottom w:w="0" w:type="dxa"/>
-          </w:tblCellMar>
-        </w:tblPrEx>
         <w:tc>
           <w:tcPr>
             <w:tcW w:w="4700" w:type="dxa"/>
@@ -2648,12 +2577,6 @@
         </w:tc>
       </w:tr>
       <w:tr>
-        <w:tblPrEx>
-          <w:tblCellMar>
-            <w:top w:w="0" w:type="dxa"/>
-            <w:bottom w:w="0" w:type="dxa"/>
-          </w:tblCellMar>
-        </w:tblPrEx>
         <w:tc>
           <w:tcPr>
             <w:tcW w:w="4700" w:type="dxa"/>
@@ -2853,12 +2776,6 @@
         <w:gridCol w:w="5147"/>
       </w:tblGrid>
       <w:tr>
-        <w:tblPrEx>
-          <w:tblCellMar>
-            <w:top w:w="0" w:type="dxa"/>
-            <w:bottom w:w="0" w:type="dxa"/>
-          </w:tblCellMar>
-        </w:tblPrEx>
         <w:tc>
           <w:tcPr>
             <w:tcW w:w="3380" w:type="dxa"/>
@@ -2924,12 +2841,6 @@
         </w:tc>
       </w:tr>
       <w:tr>
-        <w:tblPrEx>
-          <w:tblCellMar>
-            <w:top w:w="0" w:type="dxa"/>
-            <w:bottom w:w="0" w:type="dxa"/>
-          </w:tblCellMar>
-        </w:tblPrEx>
         <w:tc>
           <w:tcPr>
             <w:tcW w:w="3380" w:type="dxa"/>
@@ -2938,11 +2849,13 @@
             <w:pPr>
               <w:rPr>
                 <w:sz w:val="19"/>
-              </w:rPr>
-            </w:pPr>
-            <w:r>
-              <w:rPr>
-                <w:sz w:val="19"/>
+                <w:lang w:val="en-US"/>
+              </w:rPr>
+            </w:pPr>
+            <w:r>
+              <w:rPr>
+                <w:sz w:val="19"/>
+                <w:lang w:val="en-US"/>
               </w:rPr>
               <w:t>Setup_SXA_RTX_Analytics_v1.1.3.exe</w:t>
             </w:r>
@@ -2986,12 +2899,6 @@
         </w:tc>
       </w:tr>
       <w:tr>
-        <w:tblPrEx>
-          <w:tblCellMar>
-            <w:top w:w="0" w:type="dxa"/>
-            <w:bottom w:w="0" w:type="dxa"/>
-          </w:tblCellMar>
-        </w:tblPrEx>
         <w:tc>
           <w:tcPr>
             <w:tcW w:w="3380" w:type="dxa"/>
@@ -3000,11 +2907,13 @@
             <w:pPr>
               <w:rPr>
                 <w:sz w:val="19"/>
-              </w:rPr>
-            </w:pPr>
-            <w:r>
-              <w:rPr>
-                <w:sz w:val="19"/>
+                <w:lang w:val="en-US"/>
+              </w:rPr>
+            </w:pPr>
+            <w:r>
+              <w:rPr>
+                <w:sz w:val="19"/>
+                <w:lang w:val="en-US"/>
               </w:rPr>
               <w:t>SXA-RTX-Analytics-v1.1.3-publish.zip</w:t>
             </w:r>
@@ -3284,12 +3193,14 @@
         <w:rPr>
           <w:rFonts w:ascii="Consolas" w:hAnsi="Consolas"/>
           <w:sz w:val="17"/>
-        </w:rPr>
-      </w:pPr>
-      <w:r>
-        <w:rPr>
-          <w:rFonts w:ascii="Consolas" w:hAnsi="Consolas"/>
-          <w:sz w:val="17"/>
+          <w:lang w:val="en-US"/>
+        </w:rPr>
+      </w:pPr>
+      <w:r>
+        <w:rPr>
+          <w:rFonts w:ascii="Consolas" w:hAnsi="Consolas"/>
+          <w:sz w:val="17"/>
+          <w:lang w:val="en-US"/>
         </w:rPr>
         <w:t>/health/live   Texto plano: Healthy | Unhealthy</w:t>
       </w:r>
@@ -3358,12 +3269,6 @@
         <w:gridCol w:w="2150"/>
       </w:tblGrid>
       <w:tr>
-        <w:tblPrEx>
-          <w:tblCellMar>
-            <w:top w:w="0" w:type="dxa"/>
-            <w:bottom w:w="0" w:type="dxa"/>
-          </w:tblCellMar>
-        </w:tblPrEx>
         <w:tc>
           <w:tcPr>
             <w:tcW w:w="3410" w:type="dxa"/>
@@ -3429,12 +3334,6 @@
         </w:tc>
       </w:tr>
       <w:tr>
-        <w:tblPrEx>
-          <w:tblCellMar>
-            <w:top w:w="0" w:type="dxa"/>
-            <w:bottom w:w="0" w:type="dxa"/>
-          </w:tblCellMar>
-        </w:tblPrEx>
         <w:tc>
           <w:tcPr>
             <w:tcW w:w="3410" w:type="dxa"/>
@@ -3443,11 +3342,13 @@
             <w:pPr>
               <w:rPr>
                 <w:sz w:val="19"/>
-              </w:rPr>
-            </w:pPr>
-            <w:r>
-              <w:rPr>
-                <w:sz w:val="19"/>
+                <w:lang w:val="en-US"/>
+              </w:rPr>
+            </w:pPr>
+            <w:r>
+              <w:rPr>
+                <w:sz w:val="19"/>
+                <w:lang w:val="en-US"/>
               </w:rPr>
               <w:t>SXA.RTX.Analytics.Domain.Tests</w:t>
             </w:r>
@@ -3491,12 +3392,6 @@
         </w:tc>
       </w:tr>
       <w:tr>
-        <w:tblPrEx>
-          <w:tblCellMar>
-            <w:top w:w="0" w:type="dxa"/>
-            <w:bottom w:w="0" w:type="dxa"/>
-          </w:tblCellMar>
-        </w:tblPrEx>
         <w:tc>
           <w:tcPr>
             <w:tcW w:w="3410" w:type="dxa"/>
@@ -3505,11 +3400,13 @@
             <w:pPr>
               <w:rPr>
                 <w:sz w:val="19"/>
-              </w:rPr>
-            </w:pPr>
-            <w:r>
-              <w:rPr>
-                <w:sz w:val="19"/>
+                <w:lang w:val="en-US"/>
+              </w:rPr>
+            </w:pPr>
+            <w:r>
+              <w:rPr>
+                <w:sz w:val="19"/>
+                <w:lang w:val="en-US"/>
               </w:rPr>
               <w:t>SXA.RTX.Analytics.Application.Tests</w:t>
             </w:r>
@@ -3553,12 +3450,6 @@
         </w:tc>
       </w:tr>
       <w:tr>
-        <w:tblPrEx>
-          <w:tblCellMar>
-            <w:top w:w="0" w:type="dxa"/>
-            <w:bottom w:w="0" w:type="dxa"/>
-          </w:tblCellMar>
-        </w:tblPrEx>
         <w:tc>
           <w:tcPr>
             <w:tcW w:w="3410" w:type="dxa"/>
@@ -3567,11 +3458,13 @@
             <w:pPr>
               <w:rPr>
                 <w:sz w:val="19"/>
-              </w:rPr>
-            </w:pPr>
-            <w:r>
-              <w:rPr>
-                <w:sz w:val="19"/>
+                <w:lang w:val="en-US"/>
+              </w:rPr>
+            </w:pPr>
+            <w:r>
+              <w:rPr>
+                <w:sz w:val="19"/>
+                <w:lang w:val="en-US"/>
               </w:rPr>
               <w:t>SXA.RTX.Analytics.Reporting.Tests</w:t>
             </w:r>
@@ -3615,12 +3508,6 @@
         </w:tc>
       </w:tr>
       <w:tr>
-        <w:tblPrEx>
-          <w:tblCellMar>
-            <w:top w:w="0" w:type="dxa"/>
-            <w:bottom w:w="0" w:type="dxa"/>
-          </w:tblCellMar>
-        </w:tblPrEx>
         <w:tc>
           <w:tcPr>
             <w:tcW w:w="3410" w:type="dxa"/>
@@ -3629,11 +3516,13 @@
             <w:pPr>
               <w:rPr>
                 <w:sz w:val="19"/>
-              </w:rPr>
-            </w:pPr>
-            <w:r>
-              <w:rPr>
-                <w:sz w:val="19"/>
+                <w:lang w:val="en-US"/>
+              </w:rPr>
+            </w:pPr>
+            <w:r>
+              <w:rPr>
+                <w:sz w:val="19"/>
+                <w:lang w:val="en-US"/>
               </w:rPr>
               <w:t>SXA.RTX.Analytics.Infrastructure.Tests</w:t>
             </w:r>
@@ -3677,12 +3566,6 @@
         </w:tc>
       </w:tr>
       <w:tr>
-        <w:tblPrEx>
-          <w:tblCellMar>
-            <w:top w:w="0" w:type="dxa"/>
-            <w:bottom w:w="0" w:type="dxa"/>
-          </w:tblCellMar>
-        </w:tblPrEx>
         <w:tc>
           <w:tcPr>
             <w:tcW w:w="3410" w:type="dxa"/>
@@ -3969,12 +3852,6 @@
         <w:gridCol w:w="3695"/>
       </w:tblGrid>
       <w:tr>
-        <w:tblPrEx>
-          <w:tblCellMar>
-            <w:top w:w="0" w:type="dxa"/>
-            <w:bottom w:w="0" w:type="dxa"/>
-          </w:tblCellMar>
-        </w:tblPrEx>
         <w:tc>
           <w:tcPr>
             <w:tcW w:w="1865" w:type="dxa"/>
@@ -4061,12 +3938,6 @@
         </w:tc>
       </w:tr>
       <w:tr>
-        <w:tblPrEx>
-          <w:tblCellMar>
-            <w:top w:w="0" w:type="dxa"/>
-            <w:bottom w:w="0" w:type="dxa"/>
-          </w:tblCellMar>
-        </w:tblPrEx>
         <w:tc>
           <w:tcPr>
             <w:tcW w:w="1865" w:type="dxa"/>
@@ -4141,12 +4012,6 @@
         </w:tc>
       </w:tr>
       <w:tr>
-        <w:tblPrEx>
-          <w:tblCellMar>
-            <w:top w:w="0" w:type="dxa"/>
-            <w:bottom w:w="0" w:type="dxa"/>
-          </w:tblCellMar>
-        </w:tblPrEx>
         <w:tc>
           <w:tcPr>
             <w:tcW w:w="1865" w:type="dxa"/>
@@ -4221,12 +4086,6 @@
         </w:tc>
       </w:tr>
       <w:tr>
-        <w:tblPrEx>
-          <w:tblCellMar>
-            <w:top w:w="0" w:type="dxa"/>
-            <w:bottom w:w="0" w:type="dxa"/>
-          </w:tblCellMar>
-        </w:tblPrEx>
         <w:tc>
           <w:tcPr>
             <w:tcW w:w="1865" w:type="dxa"/>
@@ -4301,12 +4160,6 @@
         </w:tc>
       </w:tr>
       <w:tr>
-        <w:tblPrEx>
-          <w:tblCellMar>
-            <w:top w:w="0" w:type="dxa"/>
-            <w:bottom w:w="0" w:type="dxa"/>
-          </w:tblCellMar>
-        </w:tblPrEx>
         <w:tc>
           <w:tcPr>
             <w:tcW w:w="1865" w:type="dxa"/>
@@ -4381,12 +4234,6 @@
         </w:tc>
       </w:tr>
       <w:tr>
-        <w:tblPrEx>
-          <w:tblCellMar>
-            <w:top w:w="0" w:type="dxa"/>
-            <w:bottom w:w="0" w:type="dxa"/>
-          </w:tblCellMar>
-        </w:tblPrEx>
         <w:tc>
           <w:tcPr>
             <w:tcW w:w="1865" w:type="dxa"/>
@@ -4461,12 +4308,6 @@
         </w:tc>
       </w:tr>
       <w:tr>
-        <w:tblPrEx>
-          <w:tblCellMar>
-            <w:top w:w="0" w:type="dxa"/>
-            <w:bottom w:w="0" w:type="dxa"/>
-          </w:tblCellMar>
-        </w:tblPrEx>
         <w:tc>
           <w:tcPr>
             <w:tcW w:w="1865" w:type="dxa"/>

</xml_diff>